<commit_message>
Add agency-clearance section to the honor pack and retrim the note
She is a New York City public employee whose title would appear beside
her name, so the pack now states plainly that no money moves in either
direction, that the project has never held a contract with the City, and
that her title need not appear at all if her agency prefers.

Note cut to the single outstanding item, since the Council drafts have
already been sent.

Co-Authored-By: Claude Opus 5 <noreply@anthropic.com>
Claude-Session: https://claude.ai/code/session_01W9UtE7X76spacWeSvBH7tv
</commit_message>
<xml_diff>
--- a/research/Honor_Materials_For_Stacy_Review_2026-08-08.docx
+++ b/research/Honor_Materials_For_Stacy_Review_2026-08-08.docx
@@ -1392,7 +1392,95 @@
         <w:spacing w:after="140"/>
       </w:pPr>
       <w:r>
-        <w:t xml:space="preserve">7. Where you can stop it</w:t>
+        <w:t xml:space="preserve">7. If your agency needs to clear this</w:t>
+      </w:r>
+    </w:p>
+    <w:p>
+      <w:pPr>
+        <w:spacing w:after="140"/>
+      </w:pPr>
+      <w:r>
+        <w:t xml:space="preserve">You work for a New York City agency, and your title and employer would appear alongside your name. That puts this in the same category as any other outside recognition a city employee receives, and it is normal to check before accepting rather than after.</w:t>
+      </w:r>
+    </w:p>
+    <w:p>
+      <w:pPr>
+        <w:spacing w:after="140"/>
+      </w:pPr>
+      <w:r>
+        <w:t xml:space="preserve">A few points that may be useful if you raise it with your agency or with the Conflicts of Interest Board:</w:t>
+      </w:r>
+    </w:p>
+    <w:p>
+      <w:pPr>
+        <w:numPr>
+          <w:ilvl w:val="0"/>
+          <w:numId w:val="1"/>
+        </w:numPr>
+        <w:spacing w:after="60"/>
+      </w:pPr>
+      <w:r>
+        <w:t xml:space="preserve">There is no money involved in any direction. No fee, no honorarium, no payment, no gift of value.</w:t>
+      </w:r>
+    </w:p>
+    <w:p>
+      <w:pPr>
+        <w:numPr>
+          <w:ilvl w:val="0"/>
+          <w:numId w:val="1"/>
+        </w:numPr>
+        <w:spacing w:after="60"/>
+      </w:pPr>
+      <w:r>
+        <w:t xml:space="preserve">The Justification Review Standard does not hold, and has never held, a contract or any other business relationship with New York City or with HPD.</w:t>
+      </w:r>
+    </w:p>
+    <w:p>
+      <w:pPr>
+        <w:numPr>
+          <w:ilvl w:val="0"/>
+          <w:numId w:val="1"/>
+        </w:numPr>
+        <w:spacing w:after="60"/>
+      </w:pPr>
+      <w:r>
+        <w:t xml:space="preserve">The work was done in your personal capacity, on public documents that were already public.</w:t>
+      </w:r>
+    </w:p>
+    <w:p>
+      <w:pPr>
+        <w:numPr>
+          <w:ilvl w:val="0"/>
+          <w:numId w:val="1"/>
+        </w:numPr>
+        <w:spacing w:after="60"/>
+      </w:pPr>
+      <w:r>
+        <w:t xml:space="preserve">Nothing requires your title to appear at all. If your agency prefers, the certificate can print your name alone, and any public listing can show your name with no employer.</w:t>
+      </w:r>
+    </w:p>
+    <w:p>
+      <w:pPr>
+        <w:spacing w:after="140"/>
+      </w:pPr>
+      <w:r>
+        <w:t xml:space="preserve">If clearance takes time, the timing is yours. Nothing here expires.</w:t>
+      </w:r>
+    </w:p>
+    <w:p>
+      <w:pPr>
+        <w:pBdr>
+          <w:bottom w:val="single" w:sz="6" w:space="1" w:color="AAAAAA"/>
+        </w:pBdr>
+      </w:pPr>
+    </w:p>
+    <w:p>
+      <w:pPr>
+        <w:pStyle w:val="Heading2"/>
+        <w:spacing w:after="140"/>
+      </w:pPr>
+      <w:r>
+        <w:t xml:space="preserve">8. Where you can stop it</w:t>
       </w:r>
     </w:p>
     <w:p>
@@ -1506,7 +1594,7 @@
         <w:spacing w:after="140"/>
       </w:pPr>
       <w:r>
-        <w:t xml:space="preserve">8. Sequence, since you asked to review before anything goes out</w:t>
+        <w:t xml:space="preserve">9. Sequence, since you asked to review before anything goes out</w:t>
       </w:r>
     </w:p>
     <w:p>

</xml_diff>

<commit_message>
Remove the What it is section and correct the Honor's scope
The removed block said one person a year, which is false: every
detection-study completer receives one. api/honor.js carried a matching
narrow framing and now states the Honor is not single-recipient, that
the roster grows to the full completer list with a distinct citation per
person, and that no copy may imply exclusivity. The RR- comparison arm
stays ineligible while blind.

Co-Authored-By: Claude Opus 5 <noreply@anthropic.com>
Claude-Session: https://claude.ai/code/session_01W9UtE7X76spacWeSvBH7tv
</commit_message>
<xml_diff>
--- a/research/Honor_Materials_For_Stacy_Review_2026-08-08.docx
+++ b/research/Honor_Materials_For_Stacy_Review_2026-08-08.docx
@@ -60,30 +60,6 @@
       </w:pPr>
       <w:r>
         <w:t xml:space="preserve">If any of it reads as overstated, tell me and I will change it.</w:t>
-      </w:r>
-    </w:p>
-    <w:p>
-      <w:pPr>
-        <w:pBdr>
-          <w:bottom w:val="single" w:sz="6" w:space="1" w:color="AAAAAA"/>
-        </w:pBdr>
-      </w:pPr>
-    </w:p>
-    <w:p>
-      <w:pPr>
-        <w:pStyle w:val="Heading2"/>
-        <w:spacing w:after="140"/>
-      </w:pPr>
-      <w:r>
-        <w:t xml:space="preserve">What it is</w:t>
-      </w:r>
-    </w:p>
-    <w:p>
-      <w:pPr>
-        <w:spacing w:after="140"/>
-      </w:pPr>
-      <w:r>
-        <w:t xml:space="preserve">A recognition given by the JRS research programme, not by a university or a government body. No fee, no membership, no obligation. One person a year for work on documentation quality in public records.</w:t>
       </w:r>
     </w:p>
     <w:p>

</xml_diff>

<commit_message>
Apply Stacyann Young's three acceptance edits
Name corrected to Stacyann Young across both endpoints, the certificate,
the honor pack and the link map. Agency title and employer removed
entirely at her request, with a comment in the roster stating they are
not to be repopulated from the study record. Her own citation wording
used verbatim, including voluntarily and public determinations.

The superseded certificate file is deleted so it cannot be sent by
mistake. Verified by extracting drawn text from the new PDF.

Co-Authored-By: Claude Opus 5 <noreply@anthropic.com>
Claude-Session: https://claude.ai/code/session_01W9UtE7X76spacWeSvBH7tv
</commit_message>
<xml_diff>
--- a/research/Honor_Materials_For_Stacy_Review_2026-08-08.docx
+++ b/research/Honor_Materials_For_Stacy_Review_2026-08-08.docx
@@ -19,7 +19,7 @@
         <w:rPr>
           <w:b/>
         </w:rPr>
-        <w:t xml:space="preserve">Stacy Young · H-2026-01 · first honoree</w:t>
+        <w:t xml:space="preserve">Stacyann Young · H-2026-01 · first honoree</w:t>
       </w:r>
     </w:p>
     <w:p>
@@ -51,7 +51,7 @@
         <w:spacing w:after="140"/>
       </w:pPr>
       <w:r>
-        <w:t xml:space="preserve">&gt; For designing and completing the public-records documentation study: 32 real determinations, advisory opinions and compliance audits, drawn from four document classes and two states and spanning twenty-one years of decisions, each assessed from the source alone and each accompanied by a written record of the basis for that assessment.</w:t>
+        <w:t xml:space="preserve">&gt; In recognition of voluntarily designing and completing a public-records documentation study of 32 public determinations, advisory opinions, and compliance audits, drawn from four document classes and two states and spanning twenty-one years of decisions, each assessed from the source alone and each accompanied by a written record of the basis for that assessment.</w:t>
       </w:r>
     </w:p>
     <w:p>
@@ -83,7 +83,7 @@
         <w:spacing w:after="140"/>
       </w:pPr>
       <w:r>
-        <w:t xml:space="preserve">Attached, drafted in your name. It prints:</w:t>
+        <w:t xml:space="preserve">Attached, drafted in your name. It prints your name alone, with no title line and no employer:</w:t>
       </w:r>
     </w:p>
     <w:p>
@@ -94,23 +94,15 @@
         <w:rPr>
           <w:b/>
         </w:rPr>
-        <w:t xml:space="preserve">Stacy Young</w:t>
-      </w:r>
-    </w:p>
-    <w:p>
-      <w:pPr>
-        <w:spacing w:after="140"/>
-      </w:pPr>
-      <w:r>
-        <w:t xml:space="preserve">Deputy Records Access Officer, NYC Department of Housing Preservation and Development</w:t>
-      </w:r>
-    </w:p>
-    <w:p>
-      <w:pPr>
-        <w:spacing w:after="140"/>
-      </w:pPr>
-      <w:r>
-        <w:t xml:space="preserve">Both are editable. If your agency would rather your title not appear, it can print your name alone.</w:t>
+        <w:t xml:space="preserve">Stacyann Young</w:t>
+      </w:r>
+    </w:p>
+    <w:p>
+      <w:pPr>
+        <w:spacing w:after="140"/>
+      </w:pPr>
+      <w:r>
+        <w:t xml:space="preserve">Your agency title and employer are removed from the certificate and from every public-facing item, at your request of 2026-08-09.</w:t>
       </w:r>
     </w:p>
     <w:p>

</xml_diff>